<commit_message>
Update Barcelona hotel routing
</commit_message>
<xml_diff>
--- a/raw/May 26 Spain Trip.docx
+++ b/raw/May 26 Spain Trip.docx
@@ -393,7 +393,7 @@
                 <w:b/>
                 <w:bCs/>
               </w:rPr>
-              <w:t xml:space="preserve">Catalonia </w:t>
+              <w:t>Renaissance Barcelona Hotel</w:t>
             </w:r>
             <w:proofErr w:type="spellStart"/>
             <w:r>
@@ -401,7 +401,6 @@
                 <w:b/>
                 <w:bCs/>
               </w:rPr>
-              <w:t>Magdalenes</w:t>
             </w:r>
             <w:proofErr w:type="spellEnd"/>
             <w:r>
@@ -409,7 +408,6 @@
                 <w:b/>
                 <w:bCs/>
               </w:rPr>
-              <w:t xml:space="preserve"> Hotel</w:t>
             </w:r>
           </w:p>
         </w:tc>
@@ -548,34 +546,7 @@
     </w:tbl>
     <w:p>
       <w:r>
-        <w:t xml:space="preserve">All three are very central choices. </w:t>
-      </w:r>
-      <w:r>
-        <w:rPr>
-          <w:b/>
-          <w:bCs/>
-        </w:rPr>
-        <w:t xml:space="preserve">Catalonia </w:t>
-      </w:r>
-      <w:proofErr w:type="spellStart"/>
-      <w:r>
-        <w:rPr>
-          <w:b/>
-          <w:bCs/>
-        </w:rPr>
-        <w:t>Magdalenes</w:t>
-      </w:r>
-      <w:proofErr w:type="spellEnd"/>
-      <w:r>
-        <w:t xml:space="preserve"> is especially convenient for the Gothic Quarter, Cathedral area, Palau de la Música, El Born, and </w:t>
-      </w:r>
-      <w:proofErr w:type="spellStart"/>
-      <w:r>
-        <w:t>Plaça</w:t>
-      </w:r>
-      <w:proofErr w:type="spellEnd"/>
-      <w:r>
-        <w:t xml:space="preserve"> de Catalunya.</w:t>
+        <w:t>All three are very central choices. Barcelona hotel note: Renaissance Barcelona Hotel puts the Barcelona base in Eixample on Pau Claris, about a 15-20 minute walk or quick taxi to the Gothic Quarter, and especially convenient for Passeig de Gracia, Casa Batllo, Casa Mila, Palau de la Musica, and Placa de Catalunya.</w:t>
       </w:r>
     </w:p>
     <w:p>
@@ -617,90 +588,13 @@
     </w:p>
     <w:p>
       <w:r>
-        <w:rPr>
-          <w:b/>
-          <w:bCs/>
-        </w:rPr>
-        <w:t>2:20 pm</w:t>
-      </w:r>
-      <w:r>
-        <w:t xml:space="preserve"> — Arrive Barcelona on UA 672</w:t>
-      </w:r>
-      <w:r>
+        <w:t>2:20 pm - Arrive Barcelona on UA 672 at Barcelona-El Prat Airport.</w:t>
         <w:br/>
-      </w:r>
-      <w:r>
-        <w:rPr>
-          <w:b/>
-          <w:bCs/>
-        </w:rPr>
-        <w:t>4:30–6:30 pm</w:t>
-      </w:r>
-      <w:r>
-        <w:t xml:space="preserve"> — Check in, rest</w:t>
-      </w:r>
-      <w:r>
+        <w:t>4:30-6:30 pm - Transfer to Renaissance Barcelona Hotel, check in, rest.</w:t>
         <w:br/>
-      </w:r>
-      <w:r>
-        <w:rPr>
-          <w:b/>
-          <w:bCs/>
-        </w:rPr>
-        <w:t>6:30–8:30 pm</w:t>
-      </w:r>
-      <w:r>
-        <w:t xml:space="preserve"> — Easy walk: Gothic Quarter, Barcelona Cathedral exterior, </w:t>
-      </w:r>
-      <w:proofErr w:type="spellStart"/>
-      <w:r>
-        <w:t>Plaça</w:t>
-      </w:r>
-      <w:proofErr w:type="spellEnd"/>
-      <w:r>
-        <w:t xml:space="preserve"> Reial, edge of La Rambla</w:t>
-      </w:r>
-      <w:r>
+        <w:t>6:30-8:30 pm - Easy walk from Renaissance Barcelona Hotel to Gothic Quarter, Barcelona Cathedral exterior, Placa Reial, edge of La Rambla.</w:t>
         <w:br/>
-      </w:r>
-      <w:r>
-        <w:rPr>
-          <w:b/>
-          <w:bCs/>
-        </w:rPr>
-        <w:t>Dinner:</w:t>
-      </w:r>
-      <w:r>
-        <w:t xml:space="preserve"> </w:t>
-      </w:r>
-      <w:r>
-        <w:rPr>
-          <w:b/>
-          <w:bCs/>
-        </w:rPr>
-        <w:t xml:space="preserve">Can </w:t>
-      </w:r>
-      <w:proofErr w:type="spellStart"/>
-      <w:r>
-        <w:rPr>
-          <w:b/>
-          <w:bCs/>
-        </w:rPr>
-        <w:t>Culleretes</w:t>
-      </w:r>
-      <w:proofErr w:type="spellEnd"/>
-      <w:r>
-        <w:t xml:space="preserve"> for a classic old Barcelona meal, or </w:t>
-      </w:r>
-      <w:r>
-        <w:rPr>
-          <w:b/>
-          <w:bCs/>
-        </w:rPr>
-        <w:t>Bodega Biarritz 1881</w:t>
-      </w:r>
-      <w:r>
-        <w:t xml:space="preserve"> for casual tapas near the Gothic Quarter.</w:t>
+        <w:t>Dinner: Can Culleretes for a classic old Barcelona meal, or Bodega Biarritz 1881 for casual tapas near the Gothic Quarter.</w:t>
       </w:r>
     </w:p>
     <w:p>
@@ -1616,163 +1510,22 @@
     </w:p>
     <w:p>
       <w:r>
-        <w:rPr>
-          <w:b/>
-          <w:bCs/>
-        </w:rPr>
-        <w:t>Morning</w:t>
-      </w:r>
-      <w:r>
-        <w:t xml:space="preserve"> — Barcelona → </w:t>
-      </w:r>
-      <w:proofErr w:type="spellStart"/>
-      <w:r>
-        <w:t>Tossa</w:t>
-      </w:r>
-      <w:proofErr w:type="spellEnd"/>
-      <w:r>
-        <w:t xml:space="preserve"> de Mar</w:t>
-      </w:r>
-      <w:r>
+        <w:t>Morning - Depart Renaissance Barcelona Hotel for Barcelona to Tossa de Mar.</w:t>
         <w:br/>
-      </w:r>
-      <w:r>
-        <w:rPr>
-          <w:b/>
-          <w:bCs/>
-        </w:rPr>
-        <w:t>Late morning</w:t>
-      </w:r>
-      <w:r>
-        <w:t xml:space="preserve"> — Vila Vella walls, old town, viewpoints</w:t>
-      </w:r>
-      <w:r>
+        <w:t>Late morning - Vila Vella walls, old town, viewpoints</w:t>
         <w:br/>
-      </w:r>
-      <w:r>
-        <w:rPr>
-          <w:b/>
-          <w:bCs/>
-        </w:rPr>
-        <w:t>Lunch:</w:t>
-      </w:r>
-      <w:r>
-        <w:t xml:space="preserve"> </w:t>
-      </w:r>
-      <w:r>
-        <w:rPr>
-          <w:b/>
-          <w:bCs/>
-        </w:rPr>
-        <w:t xml:space="preserve">La </w:t>
-      </w:r>
-      <w:proofErr w:type="spellStart"/>
-      <w:r>
-        <w:rPr>
-          <w:b/>
-          <w:bCs/>
-        </w:rPr>
-        <w:t>Cuina</w:t>
-      </w:r>
-      <w:proofErr w:type="spellEnd"/>
-      <w:r>
-        <w:rPr>
-          <w:b/>
-          <w:bCs/>
-        </w:rPr>
-        <w:t xml:space="preserve"> de Can Simón</w:t>
-      </w:r>
-      <w:r>
-        <w:t xml:space="preserve"> if you want a special seafood-focused meal; Michelin describes it as rooted in local fishing tradition, with fish and seafood sourced daily from the auction. (</w:t>
-      </w:r>
-      <w:hyperlink r:id="rId9" w:tooltip="La Cuina de Can Simón – Tossa de Mar" w:history="1">
-        <w:r>
-          <w:rPr>
-            <w:rStyle w:val="ae"/>
-          </w:rPr>
-          <w:t>Michelin Guide</w:t>
-        </w:r>
-      </w:hyperlink>
-      <w:r>
-        <w:t>)</w:t>
-      </w:r>
-      <w:r>
+        <w:t>Lunch: La Cuina de Can Simon if you want a special seafood-focused meal; Michelin describes it as rooted in local fishing tradition, with fish and seafood sourced daily from the auction.</w:t>
         <w:br/>
-        <w:t xml:space="preserve">Alternative: </w:t>
-      </w:r>
-      <w:r>
-        <w:rPr>
-          <w:b/>
-          <w:bCs/>
-        </w:rPr>
-        <w:t>Can Sophia</w:t>
-      </w:r>
-      <w:r>
-        <w:t xml:space="preserve"> or </w:t>
-      </w:r>
-      <w:r>
-        <w:rPr>
-          <w:b/>
-          <w:bCs/>
-        </w:rPr>
-        <w:t>Capri by Josep Pagès</w:t>
-      </w:r>
-      <w:r>
-        <w:t xml:space="preserve"> for a less formal but still good meal.</w:t>
-      </w:r>
-    </w:p>
-    <w:p>
-      <w:r>
-        <w:rPr>
-          <w:b/>
-          <w:bCs/>
-        </w:rPr>
-        <w:t>Afternoon</w:t>
-      </w:r>
-      <w:r>
-        <w:t xml:space="preserve"> — Beach/cove time or boat trip</w:t>
-      </w:r>
-      <w:r>
+        <w:t>Alternative: Can Sophia or Capri by Josep Pages for a less formal but still good meal.</w:t>
+      </w:r>
+    </w:p>
+    <w:p>
+      <w:r>
+        <w:t>Afternoon - Beach/cove time or boat trip</w:t>
         <w:br/>
-      </w:r>
-      <w:r>
-        <w:rPr>
-          <w:b/>
-          <w:bCs/>
-        </w:rPr>
-        <w:t>Late afternoon</w:t>
-      </w:r>
-      <w:r>
-        <w:t xml:space="preserve"> — </w:t>
-      </w:r>
-      <w:proofErr w:type="spellStart"/>
-      <w:r>
-        <w:t>Platja</w:t>
-      </w:r>
-      <w:proofErr w:type="spellEnd"/>
-      <w:r>
-        <w:t xml:space="preserve"> Gran, Es </w:t>
-      </w:r>
-      <w:proofErr w:type="spellStart"/>
-      <w:r>
-        <w:t>Codolar</w:t>
-      </w:r>
-      <w:proofErr w:type="spellEnd"/>
-      <w:r>
-        <w:t>, coffee/gelato</w:t>
-      </w:r>
-      <w:r>
+        <w:t>Late afternoon - Platja Gran, Es Codolar, coffee/gelato</w:t>
         <w:br/>
-      </w:r>
-      <w:r>
-        <w:rPr>
-          <w:b/>
-          <w:bCs/>
-        </w:rPr>
-        <w:t>Evening</w:t>
-      </w:r>
-      <w:r>
-        <w:t xml:space="preserve"> — Return to Barcelona</w:t>
+        <w:t>Evening - Return to Renaissance Barcelona Hotel in Barcelona</w:t>
       </w:r>
     </w:p>
     <w:p>
@@ -1860,51 +1613,9 @@
     </w:p>
     <w:p>
       <w:r>
-        <w:rPr>
-          <w:b/>
-          <w:bCs/>
-        </w:rPr>
-        <w:lastRenderedPageBreak/>
-        <w:t xml:space="preserve">Arrive Granada on </w:t>
-      </w:r>
-      <w:proofErr w:type="spellStart"/>
-      <w:r>
-        <w:rPr>
-          <w:b/>
-          <w:bCs/>
-        </w:rPr>
-        <w:t>VY2012</w:t>
-      </w:r>
-      <w:proofErr w:type="spellEnd"/>
-      <w:r>
+        <w:t>Check out from Renaissance Barcelona Hotel and transfer to BCN airport for VY2012.</w:t>
         <w:br/>
-        <w:t xml:space="preserve">Transfer to </w:t>
-      </w:r>
-      <w:r>
-        <w:rPr>
-          <w:b/>
-          <w:bCs/>
-        </w:rPr>
-        <w:t xml:space="preserve">Áurea Catedral by </w:t>
-      </w:r>
-      <w:proofErr w:type="spellStart"/>
-      <w:r>
-        <w:rPr>
-          <w:b/>
-          <w:bCs/>
-        </w:rPr>
-        <w:t>Eurostars</w:t>
-      </w:r>
-      <w:proofErr w:type="spellEnd"/>
-      <w:r>
-        <w:rPr>
-          <w:b/>
-          <w:bCs/>
-        </w:rPr>
-        <w:t xml:space="preserve"> Hotel Company</w:t>
-      </w:r>
-      <w:r>
-        <w:t>.</w:t>
+        <w:t>Arrive Granada and transfer to Aurea Catedral by Eurostars Hotel Company.</w:t>
       </w:r>
     </w:p>
     <w:p>

</xml_diff>